<commit_message>
chore: xoá thư mục rác do lần chạy thử lỗi prompt; dựng lại demo_output theo bộ mẫu hiện tại
- xoá 'Thư mục lưu kết quả [...]' (sinh ra khi ask() in prompt ra stdout, đã sửa)
- demo_output dựng lại từ templates/EPC-10A: 30 Word + 29 Excel, không còn 04A/04B
</commit_message>
<xml_diff>
--- a/skills/hsdt-forms/demo_output/TT79-M09A.docx
+++ b/skills/hsdt-forms/demo_output/TT79-M09A.docx
@@ -13,9 +13,7 @@
           <w:lang w:val="nl-NL"/>
         </w:rPr>
       </w:pPr>
-      <w:r>
-        <w:br w:type="page"/>
-      </w:r>
+      <w:r/>
       <w:r>
         <w:rPr>
           <w:b/>
@@ -23,7 +21,6 @@
           <w:szCs w:val="28"/>
           <w:lang w:val="nl-NL"/>
         </w:rPr>
-        <w:lastRenderedPageBreak/>
         <w:t>Mẫu số 09A (Webform trên Hệ thống)</w:t>
       </w:r>
     </w:p>

</xml_diff>